<commit_message>
fix: restore document library previews and remediate template catalogue
Production images lacked LibreOffice for docx→PDF conversion; add runtime resilience for malformed merge tags, repair broken masters, and correct pack and worker-signer metadata.

Co-authored-by: Cursor <cursoragent@cursor.com>
</commit_message>
<xml_diff>
--- a/server/templates/library/exit-interview-form/template.docx
+++ b/server/templates/library/exit-interview-form/template.docx
@@ -8790,7 +8790,7 @@
               <w:szCs w:val="16"/>
               <w:rtl w:val="0"/>
             </w:rPr>
-            <w:t xml:space="preserve">Entity_Name}} </w:t>
+            <w:t xml:space="preserve"> The Board of {org.legal_name} </w:t>
           </w:r>
         </w:p>
       </w:tc>
@@ -8961,7 +8961,7 @@
         <w:szCs w:val="28"/>
         <w:rtl w:val="0"/>
       </w:rPr>
-      <w:t xml:space="preserve">Business_Name}} &amp; Employee_Name}}</w:t>
+      <w:t xml:space="preserve">{org.name}</w:t>
     </w:r>
   </w:p>
   <w:p>

</xml_diff>